<commit_message>
Improve rename preview safety checks
</commit_message>
<xml_diff>
--- a/EclipseImageRenamer_SetupGuide.docx
+++ b/EclipseImageRenamer_SetupGuide.docx
@@ -61,6 +61,14 @@
       </w:pPr>
       <w:r>
         <w:t>Keep namespace VMS.TPS and public class Script.</w:t>
+      </w:r>
+    </w:p>
+    <w:p>
+      <w:pPr>
+        <w:pStyle w:val="ListBullet"/>
+      </w:pPr>
+      <w:r>
+        <w:t>After editing EclipseImageRenamer.cs, run .\Sync-InstallReady.ps1 so the InstallReady deployment copy matches the source.</w:t>
       </w:r>
     </w:p>
     <w:p>
@@ -240,7 +248,7 @@
         <w:pStyle w:val="ListBullet"/>
       </w:pPr>
       <w:r>
-        <w:t>Validates edited IDs for blank values and duplicate selected New IDs before calling BeginModifications().</w:t>
+        <w:t>Validates edited IDs live for blank values, duplicate selected New IDs, and IDs already used elsewhere in the patient before calling BeginModifications().</w:t>
       </w:r>
     </w:p>
     <w:p>
@@ -253,7 +261,7 @@
     </w:p>
     <w:p>
       <w:r>
-        <w:t>Run Launch-LocalPreview.bat on the development machine to open a local preview window with sample MR/CT rows. This does not open an ESAPI patient and cannot write to ARIA. It is only for checking the UI.</w:t>
+        <w:t>Run Launch-LocalPreview.bat on the development machine to open a local preview window with expanded sample MR/CT rows, including unchanged rows, duplicate/collision examples, long IDs, and edited IDs with spaces/symbols. This does not open an ESAPI patient and cannot write to ARIA. It is only for checking the UI.</w:t>
       </w:r>
     </w:p>
     <w:p>
@@ -280,7 +288,7 @@
     </w:p>
     <w:p>
       <w:r>
-        <w:t>A successful validation build confirms C# compile compatibility with the installed Varian DLLs. It does not test clinical data access.</w:t>
+        <w:t>A successful validation build confirms C# compile compatibility with the installed Varian DLLs and checks that InstallReady/EclipseImageRenamer.cs is synced with the root source copy. It does not test clinical data access.</w:t>
       </w:r>
     </w:p>
     <w:p>
@@ -328,7 +336,7 @@
         <w:pStyle w:val="ListNumber"/>
       </w:pPr>
       <w:r>
-        <w:t>Review the preview table carefully before Apply.</w:t>
+        <w:t>Review the preview table carefully before Apply; invalid edited IDs are highlighted before writing.</w:t>
       </w:r>
     </w:p>
     <w:p>
@@ -336,7 +344,7 @@
         <w:pStyle w:val="ListNumber"/>
       </w:pPr>
       <w:r>
-        <w:t>If manually editing IDs, confirm every selected New ID is correct before writing.</w:t>
+        <w:t>If manually editing IDs, confirm every selected changed New ID is correct in the final confirmation dialog before writing.</w:t>
       </w:r>
     </w:p>
     <w:p>

</xml_diff>